<commit_message>
Actividad 2.3: retematiza a pistas deportivas y corrige bugs de lanzamiento
Sustituye la app de turnos de peluqueria por el panel de reservas de
pistas deportivas, coherente con el hilo narrativo del resto del Tema 2.
Anade el Paso 4 (lanzar desde la plantilla, movido desde la Parte B) y
redisena la Parte B como reto real: una segunda plantilla con otra
aplicacion instalada. Corrige varios bugs encontrados en pruebas en vivo
contra AWS: falta de --associate-public-ip-address en el run-instances
del Paso 1, y la misma asignacion de IP publica ausente en la plantilla
de lanzamiento del Paso 3. Enriquece la teoria de maquinas virtuales
(escalera de tamanos de instancia, vCPU, plantillas de lanzamiento vs
infraestructura como codigo) y corrige una referencia cruzada incorrecta
en la Actividad 2.1.
</commit_message>
<xml_diff>
--- a/docs/tema2/plantillas/Actividad_2_3_INU_Plantilla.docx
+++ b/docs/tema2/plantillas/Actividad_2_3_INU_Plantilla.docx
@@ -167,7 +167,7 @@
                 <w:sz w:val="20"/>
                 <w:szCs w:val="20"/>
               </w:rPr>
-              <w:t xml:space="preserve">Identificador de recursos usado (ej. turnos-app-&lt;tu-identificador&gt;): _______________________</w:t>
+              <w:t xml:space="preserve">Identificador de recursos usado (ej. pistas-panel-&lt;tu-identificador&gt;): _______________________</w:t>
             </w:r>
           </w:p>
         </w:tc>
@@ -222,7 +222,7 @@
           <w:sz w:val="24"/>
           <w:szCs w:val="24"/>
         </w:rPr>
-        <w:t xml:space="preserve">Paso 1 — Despliega la app de turnos con user data, solo en los puertos necesarios</w:t>
+        <w:t xml:space="preserve">Paso 1 — Despliega el panel de reservas con user data, solo en los puertos necesarios</w:t>
       </w:r>
     </w:p>
     <w:tbl>
@@ -268,7 +268,7 @@
                 <w:sz w:val="20"/>
                 <w:szCs w:val="20"/>
               </w:rPr>
-              <w:t xml:space="preserve">📸 La app de turnos funcionando en el navegador</w:t>
+              <w:t xml:space="preserve">📸 Tu panel de reservas funcionando en el navegador</w:t>
             </w:r>
           </w:p>
         </w:tc>
@@ -478,7 +478,7 @@
                 <w:sz w:val="20"/>
                 <w:szCs w:val="20"/>
               </w:rPr>
-              <w:t xml:space="preserve">📸 La AMI propia en estado available, con su nombre y tamaño</w:t>
+              <w:t xml:space="preserve">📸 La AMI propia en estado available, con su nombre y su ID de AMI</w:t>
             </w:r>
           </w:p>
         </w:tc>
@@ -532,29 +532,6 @@
       <w:r>
         <w:br w:type="page"/>
       </w:r>
-    </w:p>
-    <w:p>
-      <w:pPr>
-        <w:shd w:fill="3949AB" w:val="clear"/>
-        <w:spacing w:after="0" w:before="320"/>
-        <w:ind w:left="200" w:right="200"/>
-      </w:pPr>
-      <w:r>
-        <w:rPr>
-          <w:rFonts w:ascii="Arial" w:cs="Arial" w:eastAsia="Arial" w:hAnsi="Arial"/>
-          <w:b/>
-          <w:bCs/>
-          <w:color w:val="FFFFFF"/>
-          <w:sz w:val="26"/>
-          <w:szCs w:val="26"/>
-        </w:rPr>
-        <w:t xml:space="preserve">Parte B — Reto: plantilla de lanzamiento y comparación de coste</w:t>
-      </w:r>
-    </w:p>
-    <w:p>
-      <w:pPr>
-        <w:spacing w:after="120"/>
-      </w:pPr>
     </w:p>
     <w:p>
       <w:pPr>
@@ -572,21 +549,7 @@
           <w:sz w:val="24"/>
           <w:szCs w:val="24"/>
         </w:rPr>
-        <w:t xml:space="preserve">Predicción: tiempo de arranque con imagen propia</w:t>
-      </w:r>
-    </w:p>
-    <w:p>
-      <w:pPr>
-        <w:spacing w:after="100"/>
-      </w:pPr>
-      <w:r>
-        <w:rPr>
-          <w:rFonts w:ascii="Arial" w:cs="Arial" w:eastAsia="Arial" w:hAnsi="Arial"/>
-          <w:color w:val="212121"/>
-          <w:sz w:val="22"/>
-          <w:szCs w:val="22"/>
-        </w:rPr>
-        <w:t xml:space="preserve">Antes de construir la plantilla: si empaquetas tu propia AMI y arrancas una instancia desde ella, ¿cuánto crees que va a tardar en estar respondiendo, comparado con el tiempo de la Actividad 2.2 (que instalaba el servidor desde cero vía user data sobre una imagen genérica)? Escribe tu predicción y por qué crees eso.</w:t>
+        <w:t xml:space="preserve">Paso 3 — Empaqueta tu AMI en una plantilla de lanzamiento</w:t>
       </w:r>
     </w:p>
     <w:tbl>
@@ -605,8 +568,41 @@
         <w:gridCol w:w="9638"/>
       </w:tblGrid>
       <w:tr>
+        <w:tc>
+          <w:tcPr>
+            <w:tcW w:type="dxa" w:w="9638"/>
+            <w:tcBorders>
+              <w:top w:val="none" w:color="FFFFFF" w:sz="0"/>
+              <w:left w:val="none" w:color="FFFFFF" w:sz="0"/>
+              <w:bottom w:val="none" w:color="FFFFFF" w:sz="0"/>
+              <w:right w:val="none" w:color="FFFFFF" w:sz="0"/>
+            </w:tcBorders>
+            <w:shd w:fill="3949AB" w:val="clear"/>
+            <w:tcMar>
+              <w:top w:type="dxa" w:w="80"/>
+              <w:left w:type="dxa" w:w="160"/>
+              <w:bottom w:type="dxa" w:w="80"/>
+              <w:right w:type="dxa" w:w="160"/>
+            </w:tcMar>
+          </w:tcPr>
+          <w:p>
+            <w:r>
+              <w:rPr>
+                <w:rFonts w:ascii="Arial" w:cs="Arial" w:eastAsia="Arial" w:hAnsi="Arial"/>
+                <w:b/>
+                <w:bCs/>
+                <w:color w:val="FFFFFF"/>
+                <w:sz w:val="20"/>
+                <w:szCs w:val="20"/>
+              </w:rPr>
+              <w:t xml:space="preserve">📸 Resumen de tu plantilla de lanzamiento, con la AMI propia y el resto de parámetros visibles</w:t>
+            </w:r>
+          </w:p>
+        </w:tc>
+      </w:tr>
+      <w:tr>
         <w:trPr>
-          <w:trHeight w:val="480"/>
+          <w:trHeight w:val="2400"/>
         </w:trPr>
         <w:tc>
           <w:tcPr>
@@ -619,115 +615,26 @@
             </w:tcBorders>
             <w:shd w:fill="FAFAFA" w:val="clear"/>
             <w:tcMar>
-              <w:top w:type="dxa" w:w="60"/>
+              <w:top w:type="dxa" w:w="80"/>
               <w:left w:type="dxa" w:w="160"/>
-              <w:bottom w:type="dxa" w:w="60"/>
+              <w:bottom w:type="dxa" w:w="80"/>
               <w:right w:type="dxa" w:w="160"/>
             </w:tcMar>
           </w:tcPr>
           <w:p>
-            <w:r>
-              <w:rPr>
-                <w:sz w:val="22"/>
-                <w:szCs w:val="22"/>
-              </w:rPr>
-              <w:t xml:space="preserve"/>
-            </w:r>
-          </w:p>
-        </w:tc>
-      </w:tr>
-      <w:tr>
-        <w:trPr>
-          <w:trHeight w:val="480"/>
-        </w:trPr>
-        <w:tc>
-          <w:tcPr>
-            <w:tcW w:type="dxa" w:w="9638"/>
-            <w:tcBorders>
-              <w:top w:val="single" w:color="E0E0E0" w:sz="4"/>
-              <w:left w:val="single" w:color="E0E0E0" w:sz="4"/>
-              <w:bottom w:val="single" w:color="E0E0E0" w:sz="4"/>
-              <w:right w:val="single" w:color="E0E0E0" w:sz="4"/>
-            </w:tcBorders>
-            <w:shd w:fill="FAFAFA" w:val="clear"/>
-            <w:tcMar>
-              <w:top w:type="dxa" w:w="60"/>
-              <w:left w:type="dxa" w:w="160"/>
-              <w:bottom w:type="dxa" w:w="60"/>
-              <w:right w:type="dxa" w:w="160"/>
-            </w:tcMar>
-          </w:tcPr>
-          <w:p>
-            <w:r>
-              <w:rPr>
-                <w:sz w:val="22"/>
-                <w:szCs w:val="22"/>
-              </w:rPr>
-              <w:t xml:space="preserve"/>
-            </w:r>
-          </w:p>
-        </w:tc>
-      </w:tr>
-      <w:tr>
-        <w:trPr>
-          <w:trHeight w:val="480"/>
-        </w:trPr>
-        <w:tc>
-          <w:tcPr>
-            <w:tcW w:type="dxa" w:w="9638"/>
-            <w:tcBorders>
-              <w:top w:val="single" w:color="E0E0E0" w:sz="4"/>
-              <w:left w:val="single" w:color="E0E0E0" w:sz="4"/>
-              <w:bottom w:val="single" w:color="E0E0E0" w:sz="4"/>
-              <w:right w:val="single" w:color="E0E0E0" w:sz="4"/>
-            </w:tcBorders>
-            <w:shd w:fill="FAFAFA" w:val="clear"/>
-            <w:tcMar>
-              <w:top w:type="dxa" w:w="60"/>
-              <w:left w:type="dxa" w:w="160"/>
-              <w:bottom w:type="dxa" w:w="60"/>
-              <w:right w:type="dxa" w:w="160"/>
-            </w:tcMar>
-          </w:tcPr>
-          <w:p>
-            <w:r>
-              <w:rPr>
-                <w:sz w:val="22"/>
-                <w:szCs w:val="22"/>
-              </w:rPr>
-              <w:t xml:space="preserve"/>
-            </w:r>
-          </w:p>
-        </w:tc>
-      </w:tr>
-      <w:tr>
-        <w:trPr>
-          <w:trHeight w:val="480"/>
-        </w:trPr>
-        <w:tc>
-          <w:tcPr>
-            <w:tcW w:type="dxa" w:w="9638"/>
-            <w:tcBorders>
-              <w:top w:val="single" w:color="E0E0E0" w:sz="4"/>
-              <w:left w:val="single" w:color="E0E0E0" w:sz="4"/>
-              <w:bottom w:val="single" w:color="E0E0E0" w:sz="4"/>
-              <w:right w:val="single" w:color="E0E0E0" w:sz="4"/>
-            </w:tcBorders>
-            <w:shd w:fill="FAFAFA" w:val="clear"/>
-            <w:tcMar>
-              <w:top w:type="dxa" w:w="60"/>
-              <w:left w:type="dxa" w:w="160"/>
-              <w:bottom w:type="dxa" w:w="60"/>
-              <w:right w:type="dxa" w:w="160"/>
-            </w:tcMar>
-          </w:tcPr>
-          <w:p>
-            <w:r>
-              <w:rPr>
-                <w:sz w:val="22"/>
-                <w:szCs w:val="22"/>
-              </w:rPr>
-              <w:t xml:space="preserve"/>
+            <w:pPr>
+              <w:jc w:val="center"/>
+            </w:pPr>
+            <w:r>
+              <w:rPr>
+                <w:rFonts w:ascii="Arial" w:cs="Arial" w:eastAsia="Arial" w:hAnsi="Arial"/>
+                <w:i/>
+                <w:iCs/>
+                <w:color w:val="757575"/>
+                <w:sz w:val="20"/>
+                <w:szCs w:val="20"/>
+              </w:rPr>
+              <w:t xml:space="preserve">[Pega aquí la captura de pantalla]</w:t>
             </w:r>
           </w:p>
         </w:tc>
@@ -735,8 +642,13 @@
     </w:tbl>
     <w:p>
       <w:pPr>
-        <w:spacing w:after="160"/>
-      </w:pPr>
+        <w:spacing w:after="200"/>
+      </w:pPr>
+    </w:p>
+    <w:p>
+      <w:r>
+        <w:br w:type="page"/>
+      </w:r>
     </w:p>
     <w:p>
       <w:pPr>
@@ -754,7 +666,7 @@
           <w:sz w:val="24"/>
           <w:szCs w:val="24"/>
         </w:rPr>
-        <w:t xml:space="preserve">Cronómetro real de arranque</w:t>
+        <w:t xml:space="preserve">Paso 4 — Lanza instancias idénticas desde tu plantilla</w:t>
       </w:r>
     </w:p>
     <w:p>
@@ -768,7 +680,7 @@
           <w:sz w:val="22"/>
           <w:szCs w:val="22"/>
         </w:rPr>
-        <w:t xml:space="preserve">Plantilla de lanzamiento parametrizada con tu propia imagen, dos instancias idénticas lanzadas desde ella, y el tiempo de arranque cronometrado de verdad.</w:t>
+        <w:t xml:space="preserve">Antes de lanzar: si arrancas una instancia desde tu plantilla —con tu propia AMI ya lista, sin user data que instalar—, ¿cuánto crees que va a tardar en estar respondiendo, comparado con el tiempo del Paso 1? Escribe tu predicción y por qué crees eso.</w:t>
       </w:r>
     </w:p>
     <w:tbl>
@@ -787,6 +699,155 @@
         <w:gridCol w:w="9638"/>
       </w:tblGrid>
       <w:tr>
+        <w:trPr>
+          <w:trHeight w:val="480"/>
+        </w:trPr>
+        <w:tc>
+          <w:tcPr>
+            <w:tcW w:type="dxa" w:w="9638"/>
+            <w:tcBorders>
+              <w:top w:val="single" w:color="E0E0E0" w:sz="4"/>
+              <w:left w:val="single" w:color="E0E0E0" w:sz="4"/>
+              <w:bottom w:val="single" w:color="E0E0E0" w:sz="4"/>
+              <w:right w:val="single" w:color="E0E0E0" w:sz="4"/>
+            </w:tcBorders>
+            <w:shd w:fill="FAFAFA" w:val="clear"/>
+            <w:tcMar>
+              <w:top w:type="dxa" w:w="60"/>
+              <w:left w:type="dxa" w:w="160"/>
+              <w:bottom w:type="dxa" w:w="60"/>
+              <w:right w:type="dxa" w:w="160"/>
+            </w:tcMar>
+          </w:tcPr>
+          <w:p>
+            <w:r>
+              <w:rPr>
+                <w:sz w:val="22"/>
+                <w:szCs w:val="22"/>
+              </w:rPr>
+              <w:t xml:space="preserve"/>
+            </w:r>
+          </w:p>
+        </w:tc>
+      </w:tr>
+      <w:tr>
+        <w:trPr>
+          <w:trHeight w:val="480"/>
+        </w:trPr>
+        <w:tc>
+          <w:tcPr>
+            <w:tcW w:type="dxa" w:w="9638"/>
+            <w:tcBorders>
+              <w:top w:val="single" w:color="E0E0E0" w:sz="4"/>
+              <w:left w:val="single" w:color="E0E0E0" w:sz="4"/>
+              <w:bottom w:val="single" w:color="E0E0E0" w:sz="4"/>
+              <w:right w:val="single" w:color="E0E0E0" w:sz="4"/>
+            </w:tcBorders>
+            <w:shd w:fill="FAFAFA" w:val="clear"/>
+            <w:tcMar>
+              <w:top w:type="dxa" w:w="60"/>
+              <w:left w:type="dxa" w:w="160"/>
+              <w:bottom w:type="dxa" w:w="60"/>
+              <w:right w:type="dxa" w:w="160"/>
+            </w:tcMar>
+          </w:tcPr>
+          <w:p>
+            <w:r>
+              <w:rPr>
+                <w:sz w:val="22"/>
+                <w:szCs w:val="22"/>
+              </w:rPr>
+              <w:t xml:space="preserve"/>
+            </w:r>
+          </w:p>
+        </w:tc>
+      </w:tr>
+      <w:tr>
+        <w:trPr>
+          <w:trHeight w:val="480"/>
+        </w:trPr>
+        <w:tc>
+          <w:tcPr>
+            <w:tcW w:type="dxa" w:w="9638"/>
+            <w:tcBorders>
+              <w:top w:val="single" w:color="E0E0E0" w:sz="4"/>
+              <w:left w:val="single" w:color="E0E0E0" w:sz="4"/>
+              <w:bottom w:val="single" w:color="E0E0E0" w:sz="4"/>
+              <w:right w:val="single" w:color="E0E0E0" w:sz="4"/>
+            </w:tcBorders>
+            <w:shd w:fill="FAFAFA" w:val="clear"/>
+            <w:tcMar>
+              <w:top w:type="dxa" w:w="60"/>
+              <w:left w:type="dxa" w:w="160"/>
+              <w:bottom w:type="dxa" w:w="60"/>
+              <w:right w:type="dxa" w:w="160"/>
+            </w:tcMar>
+          </w:tcPr>
+          <w:p>
+            <w:r>
+              <w:rPr>
+                <w:sz w:val="22"/>
+                <w:szCs w:val="22"/>
+              </w:rPr>
+              <w:t xml:space="preserve"/>
+            </w:r>
+          </w:p>
+        </w:tc>
+      </w:tr>
+      <w:tr>
+        <w:trPr>
+          <w:trHeight w:val="480"/>
+        </w:trPr>
+        <w:tc>
+          <w:tcPr>
+            <w:tcW w:type="dxa" w:w="9638"/>
+            <w:tcBorders>
+              <w:top w:val="single" w:color="E0E0E0" w:sz="4"/>
+              <w:left w:val="single" w:color="E0E0E0" w:sz="4"/>
+              <w:bottom w:val="single" w:color="E0E0E0" w:sz="4"/>
+              <w:right w:val="single" w:color="E0E0E0" w:sz="4"/>
+            </w:tcBorders>
+            <w:shd w:fill="FAFAFA" w:val="clear"/>
+            <w:tcMar>
+              <w:top w:type="dxa" w:w="60"/>
+              <w:left w:type="dxa" w:w="160"/>
+              <w:bottom w:type="dxa" w:w="60"/>
+              <w:right w:type="dxa" w:w="160"/>
+            </w:tcMar>
+          </w:tcPr>
+          <w:p>
+            <w:r>
+              <w:rPr>
+                <w:sz w:val="22"/>
+                <w:szCs w:val="22"/>
+              </w:rPr>
+              <w:t xml:space="preserve"/>
+            </w:r>
+          </w:p>
+        </w:tc>
+      </w:tr>
+    </w:tbl>
+    <w:p>
+      <w:pPr>
+        <w:spacing w:after="120"/>
+      </w:pPr>
+    </w:p>
+    <w:tbl>
+      <w:tblPr>
+        <w:tblW w:type="dxa" w:w="9638"/>
+        <w:tblBorders>
+          <w:top w:val="single" w:color="auto" w:sz="4"/>
+          <w:left w:val="single" w:color="auto" w:sz="4"/>
+          <w:bottom w:val="single" w:color="auto" w:sz="4"/>
+          <w:right w:val="single" w:color="auto" w:sz="4"/>
+          <w:insideH w:val="single" w:color="auto" w:sz="4"/>
+          <w:insideV w:val="single" w:color="auto" w:sz="4"/>
+        </w:tblBorders>
+      </w:tblPr>
+      <w:tblGrid>
+        <w:gridCol w:w="9638"/>
+      </w:tblGrid>
+      <w:tr>
         <w:tc>
           <w:tcPr>
             <w:tcW w:type="dxa" w:w="9638"/>
@@ -814,7 +875,254 @@
                 <w:sz w:val="20"/>
                 <w:szCs w:val="20"/>
               </w:rPr>
-              <w:t xml:space="preserve">📸 Cronómetro real de arranque de las dos instancias</w:t>
+              <w:t xml:space="preserve">📸 Las dos instancias respondiendo en el navegador, y el cronómetro real de arranque</w:t>
+            </w:r>
+          </w:p>
+        </w:tc>
+      </w:tr>
+      <w:tr>
+        <w:trPr>
+          <w:trHeight w:val="2400"/>
+        </w:trPr>
+        <w:tc>
+          <w:tcPr>
+            <w:tcW w:type="dxa" w:w="9638"/>
+            <w:tcBorders>
+              <w:top w:val="single" w:color="E0E0E0" w:sz="4"/>
+              <w:left w:val="single" w:color="E0E0E0" w:sz="4"/>
+              <w:bottom w:val="single" w:color="E0E0E0" w:sz="4"/>
+              <w:right w:val="single" w:color="E0E0E0" w:sz="4"/>
+            </w:tcBorders>
+            <w:shd w:fill="FAFAFA" w:val="clear"/>
+            <w:tcMar>
+              <w:top w:type="dxa" w:w="80"/>
+              <w:left w:type="dxa" w:w="160"/>
+              <w:bottom w:type="dxa" w:w="80"/>
+              <w:right w:type="dxa" w:w="160"/>
+            </w:tcMar>
+          </w:tcPr>
+          <w:p>
+            <w:pPr>
+              <w:jc w:val="center"/>
+            </w:pPr>
+            <w:r>
+              <w:rPr>
+                <w:rFonts w:ascii="Arial" w:cs="Arial" w:eastAsia="Arial" w:hAnsi="Arial"/>
+                <w:i/>
+                <w:iCs/>
+                <w:color w:val="757575"/>
+                <w:sz w:val="20"/>
+                <w:szCs w:val="20"/>
+              </w:rPr>
+              <w:t xml:space="preserve">[Pega aquí la captura de pantalla]</w:t>
+            </w:r>
+          </w:p>
+        </w:tc>
+      </w:tr>
+    </w:tbl>
+    <w:p>
+      <w:pPr>
+        <w:spacing w:after="200"/>
+      </w:pPr>
+    </w:p>
+    <w:p>
+      <w:r>
+        <w:br w:type="page"/>
+      </w:r>
+    </w:p>
+    <w:p>
+      <w:pPr>
+        <w:shd w:fill="3949AB" w:val="clear"/>
+        <w:spacing w:after="0" w:before="320"/>
+        <w:ind w:left="200" w:right="200"/>
+      </w:pPr>
+      <w:r>
+        <w:rPr>
+          <w:rFonts w:ascii="Arial" w:cs="Arial" w:eastAsia="Arial" w:hAnsi="Arial"/>
+          <w:b/>
+          <w:bCs/>
+          <w:color w:val="FFFFFF"/>
+          <w:sz w:val="26"/>
+          <w:szCs w:val="26"/>
+        </w:rPr>
+        <w:t xml:space="preserve">Parte B — Reto: la misma receta, con otra aplicación distinta</w:t>
+      </w:r>
+    </w:p>
+    <w:p>
+      <w:pPr>
+        <w:spacing w:after="120"/>
+      </w:pPr>
+    </w:p>
+    <w:p>
+      <w:pPr>
+        <w:pBdr>
+          <w:bottom w:val="single" w:color="FFA000" w:sz="4" w:space="1"/>
+        </w:pBdr>
+        <w:spacing w:after="120" w:before="240"/>
+      </w:pPr>
+      <w:r>
+        <w:rPr>
+          <w:rFonts w:ascii="Arial" w:cs="Arial" w:eastAsia="Arial" w:hAnsi="Arial"/>
+          <w:b/>
+          <w:bCs/>
+          <w:color w:val="3949AB"/>
+          <w:sz w:val="24"/>
+          <w:szCs w:val="24"/>
+        </w:rPr>
+        <w:t xml:space="preserve">Tu segunda plantilla, con otra aplicación instalada</w:t>
+      </w:r>
+    </w:p>
+    <w:p>
+      <w:pPr>
+        <w:spacing w:after="100"/>
+      </w:pPr>
+      <w:r>
+        <w:rPr>
+          <w:rFonts w:ascii="Arial" w:cs="Arial" w:eastAsia="Arial" w:hAnsi="Arial"/>
+          <w:color w:val="212121"/>
+          <w:sz w:val="22"/>
+          <w:szCs w:val="22"/>
+        </w:rPr>
+        <w:t xml:space="preserve">Repite el proceso completo del Paso 1 al Paso 3 (instancia → AMI propia → plantilla de lanzamiento) con una aplicación distinta a tu elección — un WordPress, un blog estático distinto, un servicio propio tuyo... lo que quieras, siempre que no sea el panel de reservas.</w:t>
+      </w:r>
+    </w:p>
+    <w:tbl>
+      <w:tblPr>
+        <w:tblW w:type="dxa" w:w="9638"/>
+        <w:tblBorders>
+          <w:top w:val="single" w:color="auto" w:sz="4"/>
+          <w:left w:val="single" w:color="auto" w:sz="4"/>
+          <w:bottom w:val="single" w:color="auto" w:sz="4"/>
+          <w:right w:val="single" w:color="auto" w:sz="4"/>
+          <w:insideH w:val="single" w:color="auto" w:sz="4"/>
+          <w:insideV w:val="single" w:color="auto" w:sz="4"/>
+        </w:tblBorders>
+      </w:tblPr>
+      <w:tblGrid>
+        <w:gridCol w:w="9638"/>
+      </w:tblGrid>
+      <w:tr>
+        <w:tc>
+          <w:tcPr>
+            <w:tcW w:type="dxa" w:w="9638"/>
+            <w:tcBorders>
+              <w:top w:val="none" w:color="FFFFFF" w:sz="0"/>
+              <w:left w:val="none" w:color="FFFFFF" w:sz="0"/>
+              <w:bottom w:val="none" w:color="FFFFFF" w:sz="0"/>
+              <w:right w:val="none" w:color="FFFFFF" w:sz="0"/>
+            </w:tcBorders>
+            <w:shd w:fill="3949AB" w:val="clear"/>
+            <w:tcMar>
+              <w:top w:type="dxa" w:w="80"/>
+              <w:left w:type="dxa" w:w="160"/>
+              <w:bottom w:type="dxa" w:w="80"/>
+              <w:right w:type="dxa" w:w="160"/>
+            </w:tcMar>
+          </w:tcPr>
+          <w:p>
+            <w:r>
+              <w:rPr>
+                <w:rFonts w:ascii="Arial" w:cs="Arial" w:eastAsia="Arial" w:hAnsi="Arial"/>
+                <w:b/>
+                <w:bCs/>
+                <w:color w:val="FFFFFF"/>
+                <w:sz w:val="20"/>
+                <w:szCs w:val="20"/>
+              </w:rPr>
+              <w:t xml:space="preserve">📸 Tu aplicación distinta funcionando en el navegador</w:t>
+            </w:r>
+          </w:p>
+        </w:tc>
+      </w:tr>
+      <w:tr>
+        <w:trPr>
+          <w:trHeight w:val="2400"/>
+        </w:trPr>
+        <w:tc>
+          <w:tcPr>
+            <w:tcW w:type="dxa" w:w="9638"/>
+            <w:tcBorders>
+              <w:top w:val="single" w:color="E0E0E0" w:sz="4"/>
+              <w:left w:val="single" w:color="E0E0E0" w:sz="4"/>
+              <w:bottom w:val="single" w:color="E0E0E0" w:sz="4"/>
+              <w:right w:val="single" w:color="E0E0E0" w:sz="4"/>
+            </w:tcBorders>
+            <w:shd w:fill="FAFAFA" w:val="clear"/>
+            <w:tcMar>
+              <w:top w:type="dxa" w:w="80"/>
+              <w:left w:type="dxa" w:w="160"/>
+              <w:bottom w:type="dxa" w:w="80"/>
+              <w:right w:type="dxa" w:w="160"/>
+            </w:tcMar>
+          </w:tcPr>
+          <w:p>
+            <w:pPr>
+              <w:jc w:val="center"/>
+            </w:pPr>
+            <w:r>
+              <w:rPr>
+                <w:rFonts w:ascii="Arial" w:cs="Arial" w:eastAsia="Arial" w:hAnsi="Arial"/>
+                <w:i/>
+                <w:iCs/>
+                <w:color w:val="757575"/>
+                <w:sz w:val="20"/>
+                <w:szCs w:val="20"/>
+              </w:rPr>
+              <w:t xml:space="preserve">[Pega aquí la captura de pantalla]</w:t>
+            </w:r>
+          </w:p>
+        </w:tc>
+      </w:tr>
+    </w:tbl>
+    <w:p>
+      <w:pPr>
+        <w:spacing w:after="120"/>
+      </w:pPr>
+    </w:p>
+    <w:tbl>
+      <w:tblPr>
+        <w:tblW w:type="dxa" w:w="9638"/>
+        <w:tblBorders>
+          <w:top w:val="single" w:color="auto" w:sz="4"/>
+          <w:left w:val="single" w:color="auto" w:sz="4"/>
+          <w:bottom w:val="single" w:color="auto" w:sz="4"/>
+          <w:right w:val="single" w:color="auto" w:sz="4"/>
+          <w:insideH w:val="single" w:color="auto" w:sz="4"/>
+          <w:insideV w:val="single" w:color="auto" w:sz="4"/>
+        </w:tblBorders>
+      </w:tblPr>
+      <w:tblGrid>
+        <w:gridCol w:w="9638"/>
+      </w:tblGrid>
+      <w:tr>
+        <w:tc>
+          <w:tcPr>
+            <w:tcW w:type="dxa" w:w="9638"/>
+            <w:tcBorders>
+              <w:top w:val="none" w:color="FFFFFF" w:sz="0"/>
+              <w:left w:val="none" w:color="FFFFFF" w:sz="0"/>
+              <w:bottom w:val="none" w:color="FFFFFF" w:sz="0"/>
+              <w:right w:val="none" w:color="FFFFFF" w:sz="0"/>
+            </w:tcBorders>
+            <w:shd w:fill="3949AB" w:val="clear"/>
+            <w:tcMar>
+              <w:top w:type="dxa" w:w="80"/>
+              <w:left w:type="dxa" w:w="160"/>
+              <w:bottom w:type="dxa" w:w="80"/>
+              <w:right w:type="dxa" w:w="160"/>
+            </w:tcMar>
+          </w:tcPr>
+          <w:p>
+            <w:r>
+              <w:rPr>
+                <w:rFonts w:ascii="Arial" w:cs="Arial" w:eastAsia="Arial" w:hAnsi="Arial"/>
+                <w:b/>
+                <w:bCs/>
+                <w:color w:val="FFFFFF"/>
+                <w:sz w:val="20"/>
+                <w:szCs w:val="20"/>
+              </w:rPr>
+              <w:t xml:space="preserve">📸 Resumen de tu segunda plantilla de lanzamiento</w:t>
             </w:r>
           </w:p>
         </w:tc>
@@ -894,7 +1202,7 @@
           <w:sz w:val="22"/>
           <w:szCs w:val="22"/>
         </w:rPr>
-        <w:t xml:space="preserve">Coste mensual estimado de mantener la misma carga (instancia sirviendo el catálogo, tráfico moderado) en tres familias distintas.</w:t>
+        <w:t xml:space="preserve">Coste mensual estimado de mantener la misma carga (instancia sirviendo tu aplicación, tráfico moderado) en tres familias distintas.</w:t>
       </w:r>
     </w:p>
     <w:tbl>

</xml_diff>

<commit_message>
Actividad 2.3: pide evidencia de que la instancia viene de la plantilla
Anade una captura mas en la Parte B: la pestana Detalles de la instancia
lanzada, mostrando el campo Plantilla de lanzamiento de origen, como
prueba de que sale de verdad de la plantilla y no de un lanzamiento
manual aparte.
</commit_message>
<xml_diff>
--- a/docs/tema2/plantillas/Actividad_2_3_INU_Plantilla.docx
+++ b/docs/tema2/plantillas/Actividad_2_3_INU_Plantilla.docx
@@ -1123,6 +1123,99 @@
                 <w:szCs w:val="20"/>
               </w:rPr>
               <w:t xml:space="preserve">📸 Resumen de tu segunda plantilla de lanzamiento</w:t>
+            </w:r>
+          </w:p>
+        </w:tc>
+      </w:tr>
+      <w:tr>
+        <w:trPr>
+          <w:trHeight w:val="2400"/>
+        </w:trPr>
+        <w:tc>
+          <w:tcPr>
+            <w:tcW w:type="dxa" w:w="9638"/>
+            <w:tcBorders>
+              <w:top w:val="single" w:color="E0E0E0" w:sz="4"/>
+              <w:left w:val="single" w:color="E0E0E0" w:sz="4"/>
+              <w:bottom w:val="single" w:color="E0E0E0" w:sz="4"/>
+              <w:right w:val="single" w:color="E0E0E0" w:sz="4"/>
+            </w:tcBorders>
+            <w:shd w:fill="FAFAFA" w:val="clear"/>
+            <w:tcMar>
+              <w:top w:type="dxa" w:w="80"/>
+              <w:left w:type="dxa" w:w="160"/>
+              <w:bottom w:type="dxa" w:w="80"/>
+              <w:right w:type="dxa" w:w="160"/>
+            </w:tcMar>
+          </w:tcPr>
+          <w:p>
+            <w:pPr>
+              <w:jc w:val="center"/>
+            </w:pPr>
+            <w:r>
+              <w:rPr>
+                <w:rFonts w:ascii="Arial" w:cs="Arial" w:eastAsia="Arial" w:hAnsi="Arial"/>
+                <w:i/>
+                <w:iCs/>
+                <w:color w:val="757575"/>
+                <w:sz w:val="20"/>
+                <w:szCs w:val="20"/>
+              </w:rPr>
+              <w:t xml:space="preserve">[Pega aquí la captura de pantalla]</w:t>
+            </w:r>
+          </w:p>
+        </w:tc>
+      </w:tr>
+    </w:tbl>
+    <w:p>
+      <w:pPr>
+        <w:spacing w:after="120"/>
+      </w:pPr>
+    </w:p>
+    <w:tbl>
+      <w:tblPr>
+        <w:tblW w:type="dxa" w:w="9638"/>
+        <w:tblBorders>
+          <w:top w:val="single" w:color="auto" w:sz="4"/>
+          <w:left w:val="single" w:color="auto" w:sz="4"/>
+          <w:bottom w:val="single" w:color="auto" w:sz="4"/>
+          <w:right w:val="single" w:color="auto" w:sz="4"/>
+          <w:insideH w:val="single" w:color="auto" w:sz="4"/>
+          <w:insideV w:val="single" w:color="auto" w:sz="4"/>
+        </w:tblBorders>
+      </w:tblPr>
+      <w:tblGrid>
+        <w:gridCol w:w="9638"/>
+      </w:tblGrid>
+      <w:tr>
+        <w:tc>
+          <w:tcPr>
+            <w:tcW w:type="dxa" w:w="9638"/>
+            <w:tcBorders>
+              <w:top w:val="none" w:color="FFFFFF" w:sz="0"/>
+              <w:left w:val="none" w:color="FFFFFF" w:sz="0"/>
+              <w:bottom w:val="none" w:color="FFFFFF" w:sz="0"/>
+              <w:right w:val="none" w:color="FFFFFF" w:sz="0"/>
+            </w:tcBorders>
+            <w:shd w:fill="3949AB" w:val="clear"/>
+            <w:tcMar>
+              <w:top w:type="dxa" w:w="80"/>
+              <w:left w:type="dxa" w:w="160"/>
+              <w:bottom w:type="dxa" w:w="80"/>
+              <w:right w:type="dxa" w:w="160"/>
+            </w:tcMar>
+          </w:tcPr>
+          <w:p>
+            <w:r>
+              <w:rPr>
+                <w:rFonts w:ascii="Arial" w:cs="Arial" w:eastAsia="Arial" w:hAnsi="Arial"/>
+                <w:b/>
+                <w:bCs/>
+                <w:color w:val="FFFFFF"/>
+                <w:sz w:val="20"/>
+                <w:szCs w:val="20"/>
+              </w:rPr>
+              <w:t xml:space="preserve">📸 La instancia lanzada, con su pestaña Detalles mostrando la plantilla de lanzamiento de origen</w:t>
             </w:r>
           </w:p>
         </w:tc>

</xml_diff>